<commit_message>
A doc file, the csv metric and code
The doc file has been updated to provide a summary of the metric used. Please take a look at the last line of the metrics section so that you save the mentioned metric in the rds file.
</commit_message>
<xml_diff>
--- a/STAT638_Projects_updated_Group_6.docx
+++ b/STAT638_Projects_updated_Group_6.docx
@@ -8683,13 +8683,19 @@
           </m:sub>
         </m:sSub>
         <m:r>
+          <w:rPr>
+            <w:rFonts w:ascii="Cambria Math" w:hAnsi="Cambria Math" w:cs="Times New Roman"/>
+          </w:rPr>
+          <m:t>~</m:t>
+        </m:r>
+        <m:r>
           <m:rPr>
             <m:scr m:val="script"/>
           </m:rPr>
           <w:rPr>
             <w:rFonts w:ascii="Cambria Math" w:hAnsi="Cambria Math" w:cs="Times New Roman"/>
           </w:rPr>
-          <m:t>~N</m:t>
+          <m:t>N</m:t>
         </m:r>
         <m:d>
           <m:dPr>
@@ -8790,13 +8796,19 @@
           </m:e>
         </m:func>
         <m:r>
+          <w:rPr>
+            <w:rFonts w:ascii="Cambria Math" w:hAnsi="Cambria Math" w:cs="Times New Roman"/>
+          </w:rPr>
+          <m:t>~</m:t>
+        </m:r>
+        <m:r>
           <m:rPr>
             <m:scr m:val="script"/>
           </m:rPr>
           <w:rPr>
             <w:rFonts w:ascii="Cambria Math" w:hAnsi="Cambria Math" w:cs="Times New Roman"/>
           </w:rPr>
-          <m:t>~N</m:t>
+          <m:t>N</m:t>
         </m:r>
         <m:d>
           <m:dPr>
@@ -9682,13 +9694,19 @@
           </m:sub>
         </m:sSub>
         <m:r>
+          <w:rPr>
+            <w:rFonts w:ascii="Cambria Math" w:hAnsi="Cambria Math" w:cs="Times New Roman"/>
+          </w:rPr>
+          <m:t>~</m:t>
+        </m:r>
+        <m:r>
           <m:rPr>
             <m:scr m:val="script"/>
           </m:rPr>
           <w:rPr>
             <w:rFonts w:ascii="Cambria Math" w:hAnsi="Cambria Math" w:cs="Times New Roman"/>
           </w:rPr>
-          <m:t>~N</m:t>
+          <m:t>N</m:t>
         </m:r>
         <m:d>
           <m:dPr>
@@ -9704,7 +9722,13 @@
               <w:rPr>
                 <w:rFonts w:ascii="Cambria Math" w:hAnsi="Cambria Math" w:cs="Times New Roman"/>
               </w:rPr>
-              <m:t xml:space="preserve">-0.343, </m:t>
+              <m:t>-</m:t>
+            </m:r>
+            <m:r>
+              <w:rPr>
+                <w:rFonts w:ascii="Cambria Math" w:hAnsi="Cambria Math" w:cs="Times New Roman"/>
+              </w:rPr>
+              <m:t xml:space="preserve">0.343, </m:t>
             </m:r>
             <m:sSup>
               <m:sSupPr>
@@ -9781,13 +9805,19 @@
             </m:sub>
           </m:sSub>
           <m:r>
+            <w:rPr>
+              <w:rFonts w:ascii="Cambria Math" w:hAnsi="Cambria Math" w:cs="Times New Roman"/>
+            </w:rPr>
+            <m:t>~</m:t>
+          </m:r>
+          <m:r>
             <m:rPr>
               <m:scr m:val="script"/>
             </m:rPr>
             <w:rPr>
               <w:rFonts w:ascii="Cambria Math" w:hAnsi="Cambria Math" w:cs="Times New Roman"/>
             </w:rPr>
-            <m:t>~N</m:t>
+            <m:t>N</m:t>
           </m:r>
           <m:d>
             <m:dPr>
@@ -9803,7 +9833,13 @@
                 <w:rPr>
                   <w:rFonts w:ascii="Cambria Math" w:hAnsi="Cambria Math" w:cs="Times New Roman"/>
                 </w:rPr>
-                <m:t xml:space="preserve">-0.773, </m:t>
+                <m:t>-</m:t>
+              </m:r>
+              <m:r>
+                <w:rPr>
+                  <w:rFonts w:ascii="Cambria Math" w:hAnsi="Cambria Math" w:cs="Times New Roman"/>
+                </w:rPr>
+                <m:t xml:space="preserve">0.773, </m:t>
               </m:r>
               <m:sSup>
                 <m:sSupPr>
@@ -9881,13 +9917,19 @@
             </m:sub>
           </m:sSub>
           <m:r>
+            <w:rPr>
+              <w:rFonts w:ascii="Cambria Math" w:hAnsi="Cambria Math" w:cs="Times New Roman"/>
+            </w:rPr>
+            <m:t>~</m:t>
+          </m:r>
+          <m:r>
             <m:rPr>
               <m:scr m:val="script"/>
             </m:rPr>
             <w:rPr>
               <w:rFonts w:ascii="Cambria Math" w:hAnsi="Cambria Math" w:cs="Times New Roman"/>
             </w:rPr>
-            <m:t>~N</m:t>
+            <m:t>N</m:t>
           </m:r>
           <m:d>
             <m:dPr>
@@ -9903,7 +9945,13 @@
                 <w:rPr>
                   <w:rFonts w:ascii="Cambria Math" w:hAnsi="Cambria Math" w:cs="Times New Roman"/>
                 </w:rPr>
-                <m:t xml:space="preserve">-1.939, </m:t>
+                <m:t>-</m:t>
+              </m:r>
+              <m:r>
+                <w:rPr>
+                  <w:rFonts w:ascii="Cambria Math" w:hAnsi="Cambria Math" w:cs="Times New Roman"/>
+                </w:rPr>
+                <m:t xml:space="preserve">1.939, </m:t>
               </m:r>
               <m:sSup>
                 <m:sSupPr>
@@ -9977,13 +10025,19 @@
           </m:sub>
         </m:sSub>
         <m:r>
+          <w:rPr>
+            <w:rFonts w:ascii="Cambria Math" w:hAnsi="Cambria Math" w:cs="Times New Roman"/>
+          </w:rPr>
+          <m:t>~</m:t>
+        </m:r>
+        <m:r>
           <m:rPr>
             <m:scr m:val="script"/>
           </m:rPr>
           <w:rPr>
             <w:rFonts w:ascii="Cambria Math" w:hAnsi="Cambria Math" w:cs="Times New Roman"/>
           </w:rPr>
-          <m:t>~N</m:t>
+          <m:t>N</m:t>
         </m:r>
         <m:d>
           <m:dPr>
@@ -9999,7 +10053,13 @@
               <w:rPr>
                 <w:rFonts w:ascii="Cambria Math" w:hAnsi="Cambria Math" w:cs="Times New Roman"/>
               </w:rPr>
-              <m:t xml:space="preserve">-0.33, </m:t>
+              <m:t>-</m:t>
+            </m:r>
+            <m:r>
+              <w:rPr>
+                <w:rFonts w:ascii="Cambria Math" w:hAnsi="Cambria Math" w:cs="Times New Roman"/>
+              </w:rPr>
+              <m:t xml:space="preserve">0.33, </m:t>
             </m:r>
             <m:sSup>
               <m:sSupPr>
@@ -10076,13 +10136,19 @@
             </m:sub>
           </m:sSub>
           <m:r>
+            <w:rPr>
+              <w:rFonts w:ascii="Cambria Math" w:hAnsi="Cambria Math" w:cs="Times New Roman"/>
+            </w:rPr>
+            <m:t>~</m:t>
+          </m:r>
+          <m:r>
             <m:rPr>
               <m:scr m:val="script"/>
             </m:rPr>
             <w:rPr>
               <w:rFonts w:ascii="Cambria Math" w:hAnsi="Cambria Math" w:cs="Times New Roman"/>
             </w:rPr>
-            <m:t>~N</m:t>
+            <m:t>N</m:t>
           </m:r>
           <m:d>
             <m:dPr>
@@ -11821,13 +11887,7 @@
           <w:rPr>
             <w:rFonts w:ascii="Cambria Math" w:hAnsi="Cambria Math" w:cs="Times New Roman"/>
           </w:rPr>
-          <m:t>=</m:t>
-        </m:r>
-        <m:r>
-          <w:rPr>
-            <w:rFonts w:ascii="Cambria Math" w:hAnsi="Cambria Math" w:cs="Times New Roman"/>
-          </w:rPr>
-          <m:t>exp</m:t>
+          <m:t>=exp</m:t>
         </m:r>
         <m:d>
           <m:dPr>
@@ -12668,13 +12728,7 @@
               <w:rPr>
                 <w:rFonts w:ascii="Cambria Math" w:hAnsi="Cambria Math" w:cs="Times New Roman"/>
               </w:rPr>
-              <m:t>,k</m:t>
-            </m:r>
-            <m:r>
-              <w:rPr>
-                <w:rFonts w:ascii="Cambria Math" w:hAnsi="Cambria Math" w:cs="Times New Roman"/>
-              </w:rPr>
-              <m:t>|D</m:t>
+              <m:t>,k|D</m:t>
             </m:r>
           </m:e>
         </m:d>
@@ -12782,13 +12836,7 @@
           <w:rPr>
             <w:rFonts w:ascii="Cambria Math" w:hAnsi="Cambria Math" w:cs="Times New Roman"/>
           </w:rPr>
-          <m:t>⟹</m:t>
-        </m:r>
-        <m:r>
-          <w:rPr>
-            <w:rFonts w:ascii="Cambria Math" w:hAnsi="Cambria Math" w:cs="Times New Roman"/>
-          </w:rPr>
-          <m:t>p</m:t>
+          <m:t>⟹p</m:t>
         </m:r>
         <m:d>
           <m:dPr>
@@ -12813,13 +12861,7 @@
               <w:rPr>
                 <w:rFonts w:ascii="Cambria Math" w:hAnsi="Cambria Math" w:cs="Times New Roman"/>
               </w:rPr>
-              <m:t>,k</m:t>
-            </m:r>
-            <m:r>
-              <w:rPr>
-                <w:rFonts w:ascii="Cambria Math" w:hAnsi="Cambria Math" w:cs="Times New Roman"/>
-              </w:rPr>
-              <m:t>|D</m:t>
+              <m:t>,k|D</m:t>
             </m:r>
           </m:e>
         </m:d>
@@ -13261,13 +13303,7 @@
           <w:rPr>
             <w:rFonts w:ascii="Cambria Math" w:hAnsi="Cambria Math" w:cs="Times New Roman"/>
           </w:rPr>
-          <m:t>,</m:t>
-        </m:r>
-        <m:r>
-          <w:rPr>
-            <w:rFonts w:ascii="Cambria Math" w:hAnsi="Cambria Math" w:cs="Times New Roman"/>
-          </w:rPr>
-          <m:t>p</m:t>
+          <m:t>,p</m:t>
         </m:r>
         <m:d>
           <m:dPr>
@@ -13300,13 +13336,7 @@
           <w:rPr>
             <w:rFonts w:ascii="Cambria Math" w:hAnsi="Cambria Math" w:cs="Times New Roman"/>
           </w:rPr>
-          <m:t>→</m:t>
-        </m:r>
-        <m:r>
-          <w:rPr>
-            <w:rFonts w:ascii="Cambria Math" w:hAnsi="Cambria Math" w:cs="Times New Roman"/>
-          </w:rPr>
-          <m:t>p</m:t>
+          <m:t>→p</m:t>
         </m:r>
         <m:d>
           <m:dPr>
@@ -13426,13 +13456,7 @@
           <w:rPr>
             <w:rFonts w:ascii="Cambria Math" w:hAnsi="Cambria Math" w:cs="Times New Roman"/>
           </w:rPr>
-          <m:t xml:space="preserve">, </m:t>
-        </m:r>
-        <m:r>
-          <w:rPr>
-            <w:rFonts w:ascii="Cambria Math" w:hAnsi="Cambria Math" w:cs="Times New Roman"/>
-          </w:rPr>
-          <m:t>S</m:t>
+          <m:t>, S</m:t>
         </m:r>
         <m:d>
           <m:dPr>
@@ -13456,13 +13480,7 @@
           <w:rPr>
             <w:rFonts w:ascii="Cambria Math" w:hAnsi="Cambria Math" w:cs="Times New Roman"/>
           </w:rPr>
-          <m:t xml:space="preserve">, </m:t>
-        </m:r>
-        <m:r>
-          <w:rPr>
-            <w:rFonts w:ascii="Cambria Math" w:hAnsi="Cambria Math" w:cs="Times New Roman"/>
-          </w:rPr>
-          <m:t>S</m:t>
+          <m:t>, S</m:t>
         </m:r>
         <m:d>
           <m:dPr>
@@ -25671,13 +25689,7 @@
           <w:rPr>
             <w:rFonts w:ascii="Cambria Math" w:hAnsi="Cambria Math" w:cs="Times New Roman"/>
           </w:rPr>
-          <m:t>,</m:t>
-        </m:r>
-        <m:r>
-          <w:rPr>
-            <w:rFonts w:ascii="Cambria Math" w:hAnsi="Cambria Math" w:cs="Times New Roman"/>
-          </w:rPr>
-          <m:t xml:space="preserve"> </m:t>
+          <m:t xml:space="preserve">, </m:t>
         </m:r>
       </m:oMath>
     </w:p>
@@ -26141,6 +26153,7 @@
       <w:r>
         <w:rPr>
           <w:rFonts w:ascii="Times New Roman" w:hAnsi="Times New Roman" w:cs="Times New Roman"/>
+          <w:noProof/>
         </w:rPr>
         <w:drawing>
           <wp:inline distT="0" distB="0" distL="0" distR="0" wp14:anchorId="68BF456A" wp14:editId="0A959128">
@@ -26232,6 +26245,7 @@
       <w:r>
         <w:rPr>
           <w:rFonts w:ascii="Times New Roman" w:hAnsi="Times New Roman" w:cs="Times New Roman"/>
+          <w:noProof/>
         </w:rPr>
         <w:drawing>
           <wp:inline distT="0" distB="0" distL="0" distR="0" wp14:anchorId="46981D6E" wp14:editId="7A75BFA8">
@@ -26400,6 +26414,1467 @@
         </w:rPr>
         <w:t xml:space="preserve"> </w:t>
       </w:r>
+    </w:p>
+    <w:p>
+      <w:pPr>
+        <w:jc w:val="both"/>
+        <w:rPr>
+          <w:rFonts w:ascii="Times New Roman" w:hAnsi="Times New Roman" w:cs="Times New Roman"/>
+        </w:rPr>
+      </w:pPr>
+    </w:p>
+    <w:p>
+      <w:pPr>
+        <w:jc w:val="both"/>
+        <w:rPr>
+          <w:rFonts w:ascii="Times New Roman" w:hAnsi="Times New Roman" w:cs="Times New Roman"/>
+        </w:rPr>
+      </w:pPr>
+    </w:p>
+    <w:p>
+      <w:pPr>
+        <w:jc w:val="both"/>
+        <w:rPr>
+          <w:rFonts w:ascii="Times New Roman" w:hAnsi="Times New Roman" w:cs="Times New Roman"/>
+        </w:rPr>
+      </w:pPr>
+      <w:r>
+        <w:rPr>
+          <w:rFonts w:ascii="Times New Roman" w:hAnsi="Times New Roman" w:cs="Times New Roman"/>
+        </w:rPr>
+        <w:lastRenderedPageBreak/>
+        <w:t>Metrics Used:</w:t>
+      </w:r>
+    </w:p>
+    <w:p>
+      <w:pPr>
+        <w:jc w:val="both"/>
+        <w:rPr>
+          <w:rFonts w:ascii="Times New Roman" w:hAnsi="Times New Roman" w:cs="Times New Roman"/>
+        </w:rPr>
+      </w:pPr>
+      <w:r>
+        <w:rPr>
+          <w:rFonts w:ascii="Times New Roman" w:hAnsi="Times New Roman" w:cs="Times New Roman"/>
+        </w:rPr>
+        <w:t>For model comparison, all candidate survival distributions were evaluated using the same analysis cohort, covariates, prior specifications for the common regression coefficients, and empirical-standardization procedure. The only component that differed across models was the assumed survival-time likelihood. Model selection was based primarily on predictive performance, with additional measures used to assess prediction accuracy, numerical stability, and sensitivity of the substantive conclusions.</w:t>
+      </w:r>
+    </w:p>
+    <w:p>
+      <w:pPr>
+        <w:jc w:val="both"/>
+        <w:rPr>
+          <w:rFonts w:ascii="Times New Roman" w:hAnsi="Times New Roman" w:cs="Times New Roman"/>
+        </w:rPr>
+      </w:pPr>
+      <w:r>
+        <w:rPr>
+          <w:rFonts w:ascii="Times New Roman" w:hAnsi="Times New Roman" w:cs="Times New Roman"/>
+        </w:rPr>
+        <w:t xml:space="preserve">The primary comparison criterion was </w:t>
+      </w:r>
+      <w:r>
+        <w:rPr>
+          <w:rFonts w:ascii="Times New Roman" w:hAnsi="Times New Roman" w:cs="Times New Roman"/>
+          <w:b/>
+          <w:bCs/>
+        </w:rPr>
+        <w:t>Pareto-smoothed importance-sampling leave-one-out cross-validation (PSIS-LOO)</w:t>
+      </w:r>
+      <w:r>
+        <w:rPr>
+          <w:rFonts w:ascii="Times New Roman" w:hAnsi="Times New Roman" w:cs="Times New Roman"/>
+        </w:rPr>
+        <w:t xml:space="preserve">. For each patient </w:t>
+      </w:r>
+      <w:r>
+        <w:rPr>
+          <w:rFonts w:ascii="Times New Roman" w:hAnsi="Times New Roman" w:cs="Times New Roman"/>
+        </w:rPr>
+        <w:t xml:space="preserve"> </w:t>
+      </w:r>
+      <m:oMath>
+        <m:r>
+          <w:rPr>
+            <w:rFonts w:ascii="Cambria Math" w:hAnsi="Cambria Math" w:cs="Times New Roman"/>
+          </w:rPr>
+          <m:t>i</m:t>
+        </m:r>
+      </m:oMath>
+      <w:r>
+        <w:rPr>
+          <w:rFonts w:ascii="Times New Roman" w:hAnsi="Times New Roman" w:cs="Times New Roman"/>
+        </w:rPr>
+        <w:t xml:space="preserve">, </w:t>
+      </w:r>
+      <w:r>
+        <w:rPr>
+          <w:rFonts w:ascii="Times New Roman" w:hAnsi="Times New Roman" w:cs="Times New Roman"/>
+        </w:rPr>
+        <w:t xml:space="preserve">the </w:t>
+      </w:r>
+      <w:r>
+        <w:rPr>
+          <w:rFonts w:ascii="Times New Roman" w:hAnsi="Times New Roman" w:cs="Times New Roman"/>
+          <w:b/>
+          <w:bCs/>
+        </w:rPr>
+        <w:t>leave-one-out expected log predictive density</w:t>
+      </w:r>
+      <w:r>
+        <w:rPr>
+          <w:rFonts w:ascii="Times New Roman" w:hAnsi="Times New Roman" w:cs="Times New Roman"/>
+        </w:rPr>
+        <w:t xml:space="preserve">, </w:t>
+      </w:r>
+      <m:oMath>
+        <m:sSub>
+          <m:sSubPr>
+            <m:ctrlPr>
+              <w:rPr>
+                <w:rFonts w:ascii="Cambria Math" w:hAnsi="Cambria Math" w:cs="Times New Roman"/>
+                <w:i/>
+              </w:rPr>
+            </m:ctrlPr>
+          </m:sSubPr>
+          <m:e>
+            <m:r>
+              <w:rPr>
+                <w:rFonts w:ascii="Cambria Math" w:hAnsi="Cambria Math" w:cs="Times New Roman"/>
+              </w:rPr>
+              <m:t>elpd</m:t>
+            </m:r>
+          </m:e>
+          <m:sub>
+            <m:r>
+              <w:rPr>
+                <w:rFonts w:ascii="Cambria Math" w:hAnsi="Cambria Math" w:cs="Times New Roman"/>
+              </w:rPr>
+              <m:t>LOO,i</m:t>
+            </m:r>
+          </m:sub>
+        </m:sSub>
+      </m:oMath>
+      <w:r>
+        <w:rPr>
+          <w:rFonts w:ascii="Times New Roman" w:hAnsi="Times New Roman" w:cs="Times New Roman"/>
+        </w:rPr>
+        <w:t>measures how well the model predicts that patient's observed survival outcome when that observation is effectively left out of model fitting. The overall expected log predictive density is</w:t>
+      </w:r>
+      <m:oMath>
+        <m:r>
+          <w:rPr>
+            <w:rFonts w:ascii="Cambria Math" w:hAnsi="Cambria Math" w:cs="Times New Roman"/>
+          </w:rPr>
+          <m:t>ELP</m:t>
+        </m:r>
+        <m:sSub>
+          <m:sSubPr>
+            <m:ctrlPr>
+              <w:rPr>
+                <w:rFonts w:ascii="Cambria Math" w:hAnsi="Cambria Math" w:cs="Times New Roman"/>
+              </w:rPr>
+            </m:ctrlPr>
+          </m:sSubPr>
+          <m:e>
+            <m:r>
+              <w:rPr>
+                <w:rFonts w:ascii="Cambria Math" w:hAnsi="Cambria Math" w:cs="Times New Roman"/>
+              </w:rPr>
+              <m:t>D</m:t>
+            </m:r>
+          </m:e>
+          <m:sub>
+            <m:r>
+              <w:rPr>
+                <w:rFonts w:ascii="Cambria Math" w:hAnsi="Cambria Math" w:cs="Times New Roman"/>
+              </w:rPr>
+              <m:t>LOO</m:t>
+            </m:r>
+          </m:sub>
+        </m:sSub>
+        <m:r>
+          <w:rPr>
+            <w:rFonts w:ascii="Cambria Math" w:hAnsi="Cambria Math" w:cs="Times New Roman"/>
+          </w:rPr>
+          <m:t>=</m:t>
+        </m:r>
+        <m:nary>
+          <m:naryPr>
+            <m:chr m:val="∑"/>
+            <m:limLoc m:val="undOvr"/>
+            <m:ctrlPr>
+              <w:rPr>
+                <w:rFonts w:ascii="Cambria Math" w:hAnsi="Cambria Math" w:cs="Times New Roman"/>
+              </w:rPr>
+            </m:ctrlPr>
+          </m:naryPr>
+          <m:sub>
+            <m:r>
+              <w:rPr>
+                <w:rFonts w:ascii="Cambria Math" w:hAnsi="Cambria Math" w:cs="Times New Roman"/>
+              </w:rPr>
+              <m:t>i=1</m:t>
+            </m:r>
+          </m:sub>
+          <m:sup>
+            <m:r>
+              <w:rPr>
+                <w:rFonts w:ascii="Cambria Math" w:hAnsi="Cambria Math" w:cs="Times New Roman"/>
+              </w:rPr>
+              <m:t>N</m:t>
+            </m:r>
+          </m:sup>
+          <m:e>
+            <m:r>
+              <w:rPr>
+                <w:rFonts w:ascii="Cambria Math" w:hAnsi="Cambria Math" w:cs="Times New Roman"/>
+              </w:rPr>
+              <m:t>e</m:t>
+            </m:r>
+          </m:e>
+        </m:nary>
+        <m:r>
+          <w:rPr>
+            <w:rFonts w:ascii="Cambria Math" w:hAnsi="Cambria Math" w:cs="Times New Roman"/>
+          </w:rPr>
+          <m:t>lp</m:t>
+        </m:r>
+        <m:sSub>
+          <m:sSubPr>
+            <m:ctrlPr>
+              <w:rPr>
+                <w:rFonts w:ascii="Cambria Math" w:hAnsi="Cambria Math" w:cs="Times New Roman"/>
+              </w:rPr>
+            </m:ctrlPr>
+          </m:sSubPr>
+          <m:e>
+            <m:r>
+              <w:rPr>
+                <w:rFonts w:ascii="Cambria Math" w:hAnsi="Cambria Math" w:cs="Times New Roman"/>
+              </w:rPr>
+              <m:t>d</m:t>
+            </m:r>
+          </m:e>
+          <m:sub>
+            <m:r>
+              <w:rPr>
+                <w:rFonts w:ascii="Cambria Math" w:hAnsi="Cambria Math" w:cs="Times New Roman"/>
+              </w:rPr>
+              <m:t>LOO,i</m:t>
+            </m:r>
+          </m:sub>
+        </m:sSub>
+      </m:oMath>
+    </w:p>
+    <w:p>
+      <w:pPr>
+        <w:rPr>
+          <w:rFonts w:ascii="Times New Roman" w:hAnsi="Times New Roman" w:cs="Times New Roman"/>
+        </w:rPr>
+      </w:pPr>
+      <w:r>
+        <w:rPr>
+          <w:rFonts w:ascii="Times New Roman" w:hAnsi="Times New Roman" w:cs="Times New Roman"/>
+        </w:rPr>
+        <w:t xml:space="preserve">A larger </w:t>
+      </w:r>
+      <m:oMath>
+        <m:r>
+          <w:rPr>
+            <w:rFonts w:ascii="Cambria Math" w:hAnsi="Cambria Math" w:cs="Times New Roman"/>
+          </w:rPr>
+          <m:t>ELP</m:t>
+        </m:r>
+        <m:sSub>
+          <m:sSubPr>
+            <m:ctrlPr>
+              <w:rPr>
+                <w:rFonts w:ascii="Cambria Math" w:hAnsi="Cambria Math" w:cs="Times New Roman"/>
+              </w:rPr>
+            </m:ctrlPr>
+          </m:sSubPr>
+          <m:e>
+            <m:r>
+              <w:rPr>
+                <w:rFonts w:ascii="Cambria Math" w:hAnsi="Cambria Math" w:cs="Times New Roman"/>
+              </w:rPr>
+              <m:t>D</m:t>
+            </m:r>
+          </m:e>
+          <m:sub>
+            <m:r>
+              <w:rPr>
+                <w:rFonts w:ascii="Cambria Math" w:hAnsi="Cambria Math" w:cs="Times New Roman"/>
+              </w:rPr>
+              <m:t>LOO</m:t>
+            </m:r>
+          </m:sub>
+        </m:sSub>
+      </m:oMath>
+      <w:r>
+        <w:rPr>
+          <w:rFonts w:ascii="Times New Roman" w:hAnsi="Times New Roman" w:cs="Times New Roman"/>
+        </w:rPr>
+        <w:t xml:space="preserve"> indicates better expected out-of-sample predictive performance. When comparing two models, the difference in ELPD was calculated as</w:t>
+      </w:r>
+      <w:r>
+        <w:rPr>
+          <w:rFonts w:ascii="Times New Roman" w:hAnsi="Times New Roman" w:cs="Times New Roman"/>
+        </w:rPr>
+        <w:t xml:space="preserve"> </w:t>
+      </w:r>
+      <m:oMath>
+        <m:r>
+          <m:rPr>
+            <m:sty m:val="p"/>
+          </m:rPr>
+          <w:rPr>
+            <w:rFonts w:ascii="Cambria Math" w:hAnsi="Cambria Math" w:cs="Times New Roman"/>
+          </w:rPr>
+          <m:t>Δ</m:t>
+        </m:r>
+        <m:r>
+          <w:rPr>
+            <w:rFonts w:ascii="Cambria Math" w:hAnsi="Cambria Math" w:cs="Times New Roman"/>
+          </w:rPr>
+          <m:t>ELPD=</m:t>
+        </m:r>
+        <m:nary>
+          <m:naryPr>
+            <m:chr m:val="∑"/>
+            <m:limLoc m:val="undOvr"/>
+            <m:ctrlPr>
+              <w:rPr>
+                <w:rFonts w:ascii="Cambria Math" w:hAnsi="Cambria Math" w:cs="Times New Roman"/>
+              </w:rPr>
+            </m:ctrlPr>
+          </m:naryPr>
+          <m:sub>
+            <m:r>
+              <w:rPr>
+                <w:rFonts w:ascii="Cambria Math" w:hAnsi="Cambria Math" w:cs="Times New Roman"/>
+              </w:rPr>
+              <m:t>i=1</m:t>
+            </m:r>
+          </m:sub>
+          <m:sup>
+            <m:r>
+              <w:rPr>
+                <w:rFonts w:ascii="Cambria Math" w:hAnsi="Cambria Math" w:cs="Times New Roman"/>
+              </w:rPr>
+              <m:t>N</m:t>
+            </m:r>
+          </m:sup>
+          <m:e>
+            <m:d>
+              <m:dPr>
+                <m:ctrlPr>
+                  <w:rPr>
+                    <w:rFonts w:ascii="Cambria Math" w:hAnsi="Cambria Math" w:cs="Times New Roman"/>
+                  </w:rPr>
+                </m:ctrlPr>
+              </m:dPr>
+              <m:e>
+                <m:r>
+                  <w:rPr>
+                    <w:rFonts w:ascii="Cambria Math" w:hAnsi="Cambria Math" w:cs="Times New Roman"/>
+                  </w:rPr>
+                  <m:t>elp</m:t>
+                </m:r>
+                <m:sSub>
+                  <m:sSubPr>
+                    <m:ctrlPr>
+                      <w:rPr>
+                        <w:rFonts w:ascii="Cambria Math" w:hAnsi="Cambria Math" w:cs="Times New Roman"/>
+                      </w:rPr>
+                    </m:ctrlPr>
+                  </m:sSubPr>
+                  <m:e>
+                    <m:r>
+                      <w:rPr>
+                        <w:rFonts w:ascii="Cambria Math" w:hAnsi="Cambria Math" w:cs="Times New Roman"/>
+                      </w:rPr>
+                      <m:t>d</m:t>
+                    </m:r>
+                  </m:e>
+                  <m:sub>
+                    <m:r>
+                      <w:rPr>
+                        <w:rFonts w:ascii="Cambria Math" w:hAnsi="Cambria Math" w:cs="Times New Roman"/>
+                      </w:rPr>
+                      <m:t>A,i</m:t>
+                    </m:r>
+                  </m:sub>
+                </m:sSub>
+                <m:r>
+                  <w:rPr>
+                    <w:rFonts w:ascii="Cambria Math" w:hAnsi="Cambria Math" w:cs="Times New Roman"/>
+                  </w:rPr>
+                  <m:t>-elp</m:t>
+                </m:r>
+                <m:sSub>
+                  <m:sSubPr>
+                    <m:ctrlPr>
+                      <w:rPr>
+                        <w:rFonts w:ascii="Cambria Math" w:hAnsi="Cambria Math" w:cs="Times New Roman"/>
+                      </w:rPr>
+                    </m:ctrlPr>
+                  </m:sSubPr>
+                  <m:e>
+                    <m:r>
+                      <w:rPr>
+                        <w:rFonts w:ascii="Cambria Math" w:hAnsi="Cambria Math" w:cs="Times New Roman"/>
+                      </w:rPr>
+                      <m:t>d</m:t>
+                    </m:r>
+                  </m:e>
+                  <m:sub>
+                    <m:r>
+                      <w:rPr>
+                        <w:rFonts w:ascii="Cambria Math" w:hAnsi="Cambria Math" w:cs="Times New Roman"/>
+                      </w:rPr>
+                      <m:t>B,i</m:t>
+                    </m:r>
+                  </m:sub>
+                </m:sSub>
+              </m:e>
+            </m:d>
+          </m:e>
+        </m:nary>
+      </m:oMath>
+      <w:r>
+        <w:rPr>
+          <w:rFonts w:ascii="Times New Roman" w:hAnsi="Times New Roman" w:cs="Times New Roman"/>
+        </w:rPr>
+        <w:t xml:space="preserve">, </w:t>
+      </w:r>
+      <w:r>
+        <w:rPr>
+          <w:rFonts w:ascii="Times New Roman" w:hAnsi="Times New Roman" w:cs="Times New Roman"/>
+        </w:rPr>
+        <w:t>with standard error</w:t>
+      </w:r>
+      <w:r>
+        <w:rPr>
+          <w:rFonts w:ascii="Times New Roman" w:hAnsi="Times New Roman" w:cs="Times New Roman"/>
+        </w:rPr>
+        <w:t xml:space="preserve"> </w:t>
+      </w:r>
+      <m:oMath>
+        <m:r>
+          <w:rPr>
+            <w:rFonts w:ascii="Cambria Math" w:hAnsi="Cambria Math" w:cs="Times New Roman"/>
+          </w:rPr>
+          <m:t>SE</m:t>
+        </m:r>
+        <m:d>
+          <m:dPr>
+            <m:ctrlPr>
+              <w:rPr>
+                <w:rFonts w:ascii="Cambria Math" w:hAnsi="Cambria Math" w:cs="Times New Roman"/>
+              </w:rPr>
+            </m:ctrlPr>
+          </m:dPr>
+          <m:e>
+            <m:r>
+              <m:rPr>
+                <m:sty m:val="p"/>
+              </m:rPr>
+              <w:rPr>
+                <w:rFonts w:ascii="Cambria Math" w:hAnsi="Cambria Math" w:cs="Times New Roman"/>
+              </w:rPr>
+              <m:t>Δ</m:t>
+            </m:r>
+            <m:r>
+              <w:rPr>
+                <w:rFonts w:ascii="Cambria Math" w:hAnsi="Cambria Math" w:cs="Times New Roman"/>
+              </w:rPr>
+              <m:t>ELPD</m:t>
+            </m:r>
+          </m:e>
+        </m:d>
+        <m:r>
+          <w:rPr>
+            <w:rFonts w:ascii="Cambria Math" w:hAnsi="Cambria Math" w:cs="Times New Roman"/>
+          </w:rPr>
+          <m:t>=</m:t>
+        </m:r>
+        <m:rad>
+          <m:radPr>
+            <m:degHide m:val="1"/>
+            <m:ctrlPr>
+              <w:rPr>
+                <w:rFonts w:ascii="Cambria Math" w:hAnsi="Cambria Math" w:cs="Times New Roman"/>
+              </w:rPr>
+            </m:ctrlPr>
+          </m:radPr>
+          <m:deg/>
+          <m:e>
+            <m:r>
+              <w:rPr>
+                <w:rFonts w:ascii="Cambria Math" w:hAnsi="Cambria Math" w:cs="Times New Roman"/>
+              </w:rPr>
+              <m:t>N </m:t>
+            </m:r>
+            <m:r>
+              <m:rPr>
+                <m:sty m:val="p"/>
+              </m:rPr>
+              <w:rPr>
+                <w:rFonts w:ascii="Cambria Math" w:hAnsi="Cambria Math" w:cs="Times New Roman"/>
+              </w:rPr>
+              <m:t>Var</m:t>
+            </m:r>
+            <m:d>
+              <m:dPr>
+                <m:ctrlPr>
+                  <w:rPr>
+                    <w:rFonts w:ascii="Cambria Math" w:hAnsi="Cambria Math" w:cs="Times New Roman"/>
+                  </w:rPr>
+                </m:ctrlPr>
+              </m:dPr>
+              <m:e>
+                <m:r>
+                  <w:rPr>
+                    <w:rFonts w:ascii="Cambria Math" w:hAnsi="Cambria Math" w:cs="Times New Roman"/>
+                  </w:rPr>
+                  <m:t>elp</m:t>
+                </m:r>
+                <m:sSub>
+                  <m:sSubPr>
+                    <m:ctrlPr>
+                      <w:rPr>
+                        <w:rFonts w:ascii="Cambria Math" w:hAnsi="Cambria Math" w:cs="Times New Roman"/>
+                      </w:rPr>
+                    </m:ctrlPr>
+                  </m:sSubPr>
+                  <m:e>
+                    <m:r>
+                      <w:rPr>
+                        <w:rFonts w:ascii="Cambria Math" w:hAnsi="Cambria Math" w:cs="Times New Roman"/>
+                      </w:rPr>
+                      <m:t>d</m:t>
+                    </m:r>
+                  </m:e>
+                  <m:sub>
+                    <m:r>
+                      <w:rPr>
+                        <w:rFonts w:ascii="Cambria Math" w:hAnsi="Cambria Math" w:cs="Times New Roman"/>
+                      </w:rPr>
+                      <m:t>A,i</m:t>
+                    </m:r>
+                  </m:sub>
+                </m:sSub>
+                <m:r>
+                  <w:rPr>
+                    <w:rFonts w:ascii="Cambria Math" w:hAnsi="Cambria Math" w:cs="Times New Roman"/>
+                  </w:rPr>
+                  <m:t>-elp</m:t>
+                </m:r>
+                <m:sSub>
+                  <m:sSubPr>
+                    <m:ctrlPr>
+                      <w:rPr>
+                        <w:rFonts w:ascii="Cambria Math" w:hAnsi="Cambria Math" w:cs="Times New Roman"/>
+                      </w:rPr>
+                    </m:ctrlPr>
+                  </m:sSubPr>
+                  <m:e>
+                    <m:r>
+                      <w:rPr>
+                        <w:rFonts w:ascii="Cambria Math" w:hAnsi="Cambria Math" w:cs="Times New Roman"/>
+                      </w:rPr>
+                      <m:t>d</m:t>
+                    </m:r>
+                  </m:e>
+                  <m:sub>
+                    <m:r>
+                      <w:rPr>
+                        <w:rFonts w:ascii="Cambria Math" w:hAnsi="Cambria Math" w:cs="Times New Roman"/>
+                      </w:rPr>
+                      <m:t>B,i</m:t>
+                    </m:r>
+                  </m:sub>
+                </m:sSub>
+              </m:e>
+            </m:d>
+          </m:e>
+        </m:rad>
+        <m:r>
+          <w:rPr>
+            <w:rFonts w:ascii="Cambria Math" w:hAnsi="Cambria Math" w:cs="Times New Roman"/>
+          </w:rPr>
+          <m:t>.</m:t>
+        </m:r>
+      </m:oMath>
+    </w:p>
+    <w:p>
+      <w:pPr>
+        <w:jc w:val="both"/>
+        <w:rPr>
+          <w:rFonts w:ascii="Times New Roman" w:hAnsi="Times New Roman" w:cs="Times New Roman"/>
+        </w:rPr>
+      </w:pPr>
+      <w:r>
+        <w:rPr>
+          <w:rFonts w:ascii="Times New Roman" w:hAnsi="Times New Roman" w:cs="Times New Roman"/>
+        </w:rPr>
+        <w:t xml:space="preserve">The magnitude of </w:t>
+      </w:r>
+      <m:oMath>
+        <m:r>
+          <m:rPr>
+            <m:sty m:val="p"/>
+          </m:rPr>
+          <w:rPr>
+            <w:rFonts w:ascii="Cambria Math" w:hAnsi="Cambria Math" w:cs="Times New Roman"/>
+          </w:rPr>
+          <m:t>Δ</m:t>
+        </m:r>
+        <m:r>
+          <w:rPr>
+            <w:rFonts w:ascii="Cambria Math" w:hAnsi="Cambria Math" w:cs="Times New Roman"/>
+          </w:rPr>
+          <m:t>ELPD</m:t>
+        </m:r>
+      </m:oMath>
+      <w:r>
+        <w:rPr>
+          <w:rFonts w:ascii="Times New Roman" w:hAnsi="Times New Roman" w:cs="Times New Roman"/>
+        </w:rPr>
+        <w:t xml:space="preserve"> was interpreted relative to its standard error. Thus, a numerical difference in ELPD was not considered strong evidence of superior predictive performance when the difference was small relative to </w:t>
+      </w:r>
+      <m:oMath>
+        <m:r>
+          <w:rPr>
+            <w:rFonts w:ascii="Cambria Math" w:hAnsi="Cambria Math" w:cs="Times New Roman"/>
+          </w:rPr>
+          <m:t>SE</m:t>
+        </m:r>
+        <m:d>
+          <m:dPr>
+            <m:ctrlPr>
+              <w:rPr>
+                <w:rFonts w:ascii="Cambria Math" w:hAnsi="Cambria Math" w:cs="Times New Roman"/>
+              </w:rPr>
+            </m:ctrlPr>
+          </m:dPr>
+          <m:e>
+            <m:r>
+              <m:rPr>
+                <m:sty m:val="p"/>
+              </m:rPr>
+              <w:rPr>
+                <w:rFonts w:ascii="Cambria Math" w:hAnsi="Cambria Math" w:cs="Times New Roman"/>
+              </w:rPr>
+              <m:t>Δ</m:t>
+            </m:r>
+            <m:r>
+              <w:rPr>
+                <w:rFonts w:ascii="Cambria Math" w:hAnsi="Cambria Math" w:cs="Times New Roman"/>
+              </w:rPr>
+              <m:t>ELPD</m:t>
+            </m:r>
+          </m:e>
+        </m:d>
+      </m:oMath>
+      <w:r>
+        <w:rPr>
+          <w:rFonts w:ascii="Times New Roman" w:hAnsi="Times New Roman" w:cs="Times New Roman"/>
+        </w:rPr>
+        <w:t>. The corresponding LOO information criterion,</w:t>
+      </w:r>
+      <w:r>
+        <w:rPr>
+          <w:rFonts w:ascii="Times New Roman" w:hAnsi="Times New Roman" w:cs="Times New Roman"/>
+        </w:rPr>
+        <w:t xml:space="preserve"> </w:t>
+      </w:r>
+      <m:oMath>
+        <m:r>
+          <w:rPr>
+            <w:rFonts w:ascii="Cambria Math" w:hAnsi="Cambria Math" w:cs="Times New Roman"/>
+          </w:rPr>
+          <m:t>LOOIC=-2 ELP</m:t>
+        </m:r>
+        <m:sSub>
+          <m:sSubPr>
+            <m:ctrlPr>
+              <w:rPr>
+                <w:rFonts w:ascii="Cambria Math" w:hAnsi="Cambria Math" w:cs="Times New Roman"/>
+              </w:rPr>
+            </m:ctrlPr>
+          </m:sSubPr>
+          <m:e>
+            <m:r>
+              <w:rPr>
+                <w:rFonts w:ascii="Cambria Math" w:hAnsi="Cambria Math" w:cs="Times New Roman"/>
+              </w:rPr>
+              <m:t>D</m:t>
+            </m:r>
+          </m:e>
+          <m:sub>
+            <m:r>
+              <w:rPr>
+                <w:rFonts w:ascii="Cambria Math" w:hAnsi="Cambria Math" w:cs="Times New Roman"/>
+              </w:rPr>
+              <m:t>LOO</m:t>
+            </m:r>
+          </m:sub>
+        </m:sSub>
+        <m:r>
+          <w:rPr>
+            <w:rFonts w:ascii="Cambria Math" w:hAnsi="Cambria Math" w:cs="Times New Roman"/>
+          </w:rPr>
+          <m:t>,</m:t>
+        </m:r>
+      </m:oMath>
+      <w:r>
+        <w:rPr>
+          <w:rFonts w:ascii="Times New Roman" w:hAnsi="Times New Roman" w:cs="Times New Roman"/>
+        </w:rPr>
+        <w:t xml:space="preserve"> </w:t>
+      </w:r>
+      <w:r>
+        <w:rPr>
+          <w:rFonts w:ascii="Times New Roman" w:hAnsi="Times New Roman" w:cs="Times New Roman"/>
+        </w:rPr>
+        <w:t>was also reported, for which smaller values indicate better predictive performance.</w:t>
+      </w:r>
+    </w:p>
+    <w:p>
+      <w:pPr>
+        <w:jc w:val="both"/>
+        <w:rPr>
+          <w:rFonts w:ascii="Times New Roman" w:hAnsi="Times New Roman" w:cs="Times New Roman"/>
+        </w:rPr>
+      </w:pPr>
+      <w:r>
+        <w:rPr>
+          <w:rFonts w:ascii="Times New Roman" w:hAnsi="Times New Roman" w:cs="Times New Roman"/>
+        </w:rPr>
+        <w:t xml:space="preserve">The reliability of the PSIS approximation was assessed using the </w:t>
+      </w:r>
+      <w:r>
+        <w:rPr>
+          <w:rFonts w:ascii="Times New Roman" w:hAnsi="Times New Roman" w:cs="Times New Roman"/>
+          <w:b/>
+          <w:bCs/>
+        </w:rPr>
+        <w:t>Pareto</w:t>
+      </w:r>
+      <w:r>
+        <w:rPr>
+          <w:rFonts w:ascii="Times New Roman" w:hAnsi="Times New Roman" w:cs="Times New Roman"/>
+          <w:b/>
+          <w:bCs/>
+        </w:rPr>
+        <w:t>-</w:t>
+      </w:r>
+      <m:oMath>
+        <m:r>
+          <m:rPr>
+            <m:sty m:val="bi"/>
+          </m:rPr>
+          <w:rPr>
+            <w:rFonts w:ascii="Cambria Math" w:hAnsi="Cambria Math" w:cs="Times New Roman"/>
+          </w:rPr>
+          <m:t>k</m:t>
+        </m:r>
+      </m:oMath>
+      <w:r>
+        <w:rPr>
+          <w:rFonts w:ascii="Times New Roman" w:hAnsi="Times New Roman" w:cs="Times New Roman"/>
+          <w:b/>
+          <w:bCs/>
+        </w:rPr>
+        <w:t xml:space="preserve"> </w:t>
+      </w:r>
+      <w:r>
+        <w:rPr>
+          <w:rFonts w:ascii="Times New Roman" w:hAnsi="Times New Roman" w:cs="Times New Roman"/>
+          <w:b/>
+          <w:bCs/>
+        </w:rPr>
+        <w:t>diagnostic</w:t>
+      </w:r>
+      <w:r>
+        <w:rPr>
+          <w:rFonts w:ascii="Times New Roman" w:hAnsi="Times New Roman" w:cs="Times New Roman"/>
+        </w:rPr>
+        <w:t>. This diagnostic identifies observations for which importance sampling may be unstable. Values below approximately 0.7 were considered satisfactory, whereas larger values were examined for potentially influential observations. This Pareto</w:t>
+      </w:r>
+      <w:r>
+        <w:rPr>
+          <w:rFonts w:ascii="Times New Roman" w:hAnsi="Times New Roman" w:cs="Times New Roman"/>
+        </w:rPr>
+        <w:t xml:space="preserve"> </w:t>
+      </w:r>
+      <m:oMath>
+        <m:r>
+          <w:rPr>
+            <w:rFonts w:ascii="Cambria Math" w:hAnsi="Cambria Math" w:cs="Times New Roman"/>
+          </w:rPr>
+          <m:t>k</m:t>
+        </m:r>
+      </m:oMath>
+      <w:r>
+        <w:rPr>
+          <w:rFonts w:ascii="Times New Roman" w:hAnsi="Times New Roman" w:cs="Times New Roman"/>
+        </w:rPr>
+        <w:t xml:space="preserve"> </w:t>
+      </w:r>
+      <w:r>
+        <w:rPr>
+          <w:rFonts w:ascii="Times New Roman" w:hAnsi="Times New Roman" w:cs="Times New Roman"/>
+        </w:rPr>
+        <w:t xml:space="preserve">quantity is distinct from the Weibull shape parameter </w:t>
+      </w:r>
+      <m:oMath>
+        <m:r>
+          <w:rPr>
+            <w:rFonts w:ascii="Cambria Math" w:hAnsi="Cambria Math" w:cs="Times New Roman"/>
+          </w:rPr>
+          <m:t>k</m:t>
+        </m:r>
+      </m:oMath>
+      <w:r>
+        <w:rPr>
+          <w:rFonts w:ascii="Times New Roman" w:hAnsi="Times New Roman" w:cs="Times New Roman"/>
+        </w:rPr>
+        <w:t>.</w:t>
+      </w:r>
+    </w:p>
+    <w:p>
+      <w:pPr>
+        <w:jc w:val="both"/>
+        <w:rPr>
+          <w:rFonts w:ascii="Times New Roman" w:hAnsi="Times New Roman" w:cs="Times New Roman"/>
+        </w:rPr>
+      </w:pPr>
+      <w:r>
+        <w:rPr>
+          <w:rFonts w:ascii="Times New Roman" w:hAnsi="Times New Roman" w:cs="Times New Roman"/>
+        </w:rPr>
+        <w:t xml:space="preserve">Prediction accuracy for survival probabilities was additionally assessed using the </w:t>
+      </w:r>
+      <w:r>
+        <w:rPr>
+          <w:rFonts w:ascii="Times New Roman" w:hAnsi="Times New Roman" w:cs="Times New Roman"/>
+          <w:b/>
+          <w:bCs/>
+        </w:rPr>
+        <w:t>inverse-probability-of-censoring weighted Brier score</w:t>
+      </w:r>
+      <w:r>
+        <w:rPr>
+          <w:rFonts w:ascii="Times New Roman" w:hAnsi="Times New Roman" w:cs="Times New Roman"/>
+        </w:rPr>
+        <w:t xml:space="preserve">. At a particular time </w:t>
+      </w:r>
+      <m:oMath>
+        <m:r>
+          <w:rPr>
+            <w:rFonts w:ascii="Cambria Math" w:hAnsi="Cambria Math" w:cs="Times New Roman"/>
+          </w:rPr>
+          <m:t>t</m:t>
+        </m:r>
+      </m:oMath>
+      <w:r>
+        <w:rPr>
+          <w:rFonts w:ascii="Times New Roman" w:hAnsi="Times New Roman" w:cs="Times New Roman"/>
+        </w:rPr>
+        <w:t xml:space="preserve">, </w:t>
+      </w:r>
+      <w:r>
+        <w:rPr>
+          <w:rFonts w:ascii="Times New Roman" w:hAnsi="Times New Roman" w:cs="Times New Roman"/>
+        </w:rPr>
+        <w:t>the Brier score measures the squared difference between the predicted survival probability and the observed survival status, while accounting for right censoring. Brier scores were evaluated at clinically relevant follow-up times of</w:t>
+      </w:r>
+      <w:r>
+        <w:rPr>
+          <w:rFonts w:ascii="Times New Roman" w:hAnsi="Times New Roman" w:cs="Times New Roman"/>
+        </w:rPr>
+        <w:t xml:space="preserve"> 1, 5 and 10 years.</w:t>
+      </w:r>
+    </w:p>
+    <w:p>
+      <w:pPr>
+        <w:jc w:val="both"/>
+        <w:rPr>
+          <w:rFonts w:ascii="Times New Roman" w:hAnsi="Times New Roman" w:cs="Times New Roman"/>
+        </w:rPr>
+      </w:pPr>
+      <w:r>
+        <w:rPr>
+          <w:rFonts w:ascii="Times New Roman" w:hAnsi="Times New Roman" w:cs="Times New Roman"/>
+        </w:rPr>
+        <w:t>For this metric,</w:t>
+      </w:r>
+      <w:r>
+        <w:rPr>
+          <w:rFonts w:ascii="Times New Roman" w:hAnsi="Times New Roman" w:cs="Times New Roman"/>
+        </w:rPr>
+        <w:t xml:space="preserve"> smaller Brier Score= better predictive accuracy</w:t>
+      </w:r>
+    </w:p>
+    <w:p>
+      <w:pPr>
+        <w:jc w:val="both"/>
+        <w:rPr>
+          <w:rFonts w:ascii="Times New Roman" w:hAnsi="Times New Roman" w:cs="Times New Roman"/>
+        </w:rPr>
+      </w:pPr>
+      <w:r>
+        <w:rPr>
+          <w:rFonts w:ascii="Times New Roman" w:hAnsi="Times New Roman" w:cs="Times New Roman"/>
+        </w:rPr>
+        <w:t>O</w:t>
+      </w:r>
+      <w:r>
+        <w:rPr>
+          <w:rFonts w:ascii="Times New Roman" w:hAnsi="Times New Roman" w:cs="Times New Roman"/>
+        </w:rPr>
+        <w:t xml:space="preserve">verall prediction accuracy across follow-up was summarized using the </w:t>
+      </w:r>
+      <w:r>
+        <w:rPr>
+          <w:rFonts w:ascii="Times New Roman" w:hAnsi="Times New Roman" w:cs="Times New Roman"/>
+          <w:b/>
+          <w:bCs/>
+        </w:rPr>
+        <w:t>Integrated Brier Score (IBS)</w:t>
+      </w:r>
+      <w:r>
+        <w:rPr>
+          <w:rFonts w:ascii="Times New Roman" w:hAnsi="Times New Roman" w:cs="Times New Roman"/>
+        </w:rPr>
+        <w:t>,</w:t>
+      </w:r>
+      <w:r>
+        <w:rPr>
+          <w:rFonts w:ascii="Times New Roman" w:hAnsi="Times New Roman" w:cs="Times New Roman"/>
+        </w:rPr>
+        <w:br/>
+      </w:r>
+      <m:oMathPara>
+        <m:oMath>
+          <m:r>
+            <w:rPr>
+              <w:rFonts w:ascii="Cambria Math" w:hAnsi="Cambria Math" w:cs="Times New Roman"/>
+            </w:rPr>
+            <m:t>IBS=</m:t>
+          </m:r>
+          <m:f>
+            <m:fPr>
+              <m:ctrlPr>
+                <w:rPr>
+                  <w:rFonts w:ascii="Cambria Math" w:hAnsi="Cambria Math" w:cs="Times New Roman"/>
+                </w:rPr>
+              </m:ctrlPr>
+            </m:fPr>
+            <m:num>
+              <m:r>
+                <w:rPr>
+                  <w:rFonts w:ascii="Cambria Math" w:hAnsi="Cambria Math" w:cs="Times New Roman"/>
+                </w:rPr>
+                <m:t>1</m:t>
+              </m:r>
+            </m:num>
+            <m:den>
+              <m:r>
+                <w:rPr>
+                  <w:rFonts w:ascii="Cambria Math" w:hAnsi="Cambria Math" w:cs="Times New Roman"/>
+                </w:rPr>
+                <m:t>τ</m:t>
+              </m:r>
+            </m:den>
+          </m:f>
+          <m:nary>
+            <m:naryPr>
+              <m:limLoc m:val="subSup"/>
+              <m:ctrlPr>
+                <w:rPr>
+                  <w:rFonts w:ascii="Cambria Math" w:hAnsi="Cambria Math" w:cs="Times New Roman"/>
+                </w:rPr>
+              </m:ctrlPr>
+            </m:naryPr>
+            <m:sub>
+              <m:r>
+                <w:rPr>
+                  <w:rFonts w:ascii="Cambria Math" w:hAnsi="Cambria Math" w:cs="Times New Roman"/>
+                </w:rPr>
+                <m:t>0</m:t>
+              </m:r>
+            </m:sub>
+            <m:sup>
+              <m:r>
+                <w:rPr>
+                  <w:rFonts w:ascii="Cambria Math" w:hAnsi="Cambria Math" w:cs="Times New Roman"/>
+                </w:rPr>
+                <m:t>τ</m:t>
+              </m:r>
+            </m:sup>
+            <m:e>
+              <m:r>
+                <w:rPr>
+                  <w:rFonts w:ascii="Cambria Math" w:hAnsi="Cambria Math" w:cs="Times New Roman"/>
+                </w:rPr>
+                <m:t>B</m:t>
+              </m:r>
+            </m:e>
+          </m:nary>
+          <m:r>
+            <w:rPr>
+              <w:rFonts w:ascii="Cambria Math" w:hAnsi="Cambria Math" w:cs="Times New Roman"/>
+            </w:rPr>
+            <m:t>S</m:t>
+          </m:r>
+          <m:d>
+            <m:dPr>
+              <m:ctrlPr>
+                <w:rPr>
+                  <w:rFonts w:ascii="Cambria Math" w:hAnsi="Cambria Math" w:cs="Times New Roman"/>
+                </w:rPr>
+              </m:ctrlPr>
+            </m:dPr>
+            <m:e>
+              <m:r>
+                <w:rPr>
+                  <w:rFonts w:ascii="Cambria Math" w:hAnsi="Cambria Math" w:cs="Times New Roman"/>
+                </w:rPr>
+                <m:t>t</m:t>
+              </m:r>
+            </m:e>
+          </m:d>
+          <m:r>
+            <w:rPr>
+              <w:rFonts w:ascii="Cambria Math" w:hAnsi="Cambria Math" w:cs="Times New Roman"/>
+            </w:rPr>
+            <m:t> dt,</m:t>
+          </m:r>
+        </m:oMath>
+      </m:oMathPara>
+    </w:p>
+    <w:p>
+      <w:pPr>
+        <w:jc w:val="both"/>
+        <w:rPr>
+          <w:rFonts w:ascii="Times New Roman" w:hAnsi="Times New Roman" w:cs="Times New Roman"/>
+        </w:rPr>
+      </w:pPr>
+      <w:r>
+        <w:rPr>
+          <w:rFonts w:ascii="Times New Roman" w:hAnsi="Times New Roman" w:cs="Times New Roman"/>
+        </w:rPr>
+        <w:t xml:space="preserve">with </w:t>
+      </w:r>
+      <m:oMath>
+        <m:r>
+          <w:rPr>
+            <w:rFonts w:ascii="Cambria Math" w:hAnsi="Cambria Math" w:cs="Times New Roman"/>
+          </w:rPr>
+          <m:t>τ=10</m:t>
+        </m:r>
+      </m:oMath>
+      <w:r>
+        <w:rPr>
+          <w:rFonts w:ascii="Times New Roman" w:hAnsi="Times New Roman" w:cs="Times New Roman"/>
+        </w:rPr>
+        <w:t>years for the present analysis. A smaller IBS indicates better average survival-probability prediction over the full 0–</w:t>
+      </w:r>
+      <w:proofErr w:type="gramStart"/>
+      <w:r>
+        <w:rPr>
+          <w:rFonts w:ascii="Times New Roman" w:hAnsi="Times New Roman" w:cs="Times New Roman"/>
+        </w:rPr>
+        <w:t>10 year</w:t>
+      </w:r>
+      <w:proofErr w:type="gramEnd"/>
+      <w:r>
+        <w:rPr>
+          <w:rFonts w:ascii="Times New Roman" w:hAnsi="Times New Roman" w:cs="Times New Roman"/>
+        </w:rPr>
+        <w:t xml:space="preserve"> interval.</w:t>
+      </w:r>
+    </w:p>
+    <w:p>
+      <w:pPr>
+        <w:jc w:val="both"/>
+        <w:rPr>
+          <w:rFonts w:ascii="Times New Roman" w:hAnsi="Times New Roman" w:cs="Times New Roman"/>
+        </w:rPr>
+      </w:pPr>
+      <w:r>
+        <w:rPr>
+          <w:rFonts w:ascii="Times New Roman" w:hAnsi="Times New Roman" w:cs="Times New Roman"/>
+        </w:rPr>
+        <w:t xml:space="preserve">Posterior predictive performance was also examined graphically by comparing model-based posterior survival predictions with the observed Kaplan–Meier survival patterns. These comparisons were used to determine whether each parametric distribution reproduced the overall shape of the observed survival data and the stage-specific survival patterns. </w:t>
+      </w:r>
+      <w:proofErr w:type="gramStart"/>
+      <w:r>
+        <w:rPr>
+          <w:rFonts w:ascii="Times New Roman" w:hAnsi="Times New Roman" w:cs="Times New Roman"/>
+        </w:rPr>
+        <w:t>Particular attention</w:t>
+      </w:r>
+      <w:proofErr w:type="gramEnd"/>
+      <w:r>
+        <w:rPr>
+          <w:rFonts w:ascii="Times New Roman" w:hAnsi="Times New Roman" w:cs="Times New Roman"/>
+        </w:rPr>
+        <w:t xml:space="preserve"> was given to longer follow-up periods, where predictions may be more sensitive to the assumed tail behavior of the Weibull, </w:t>
+      </w:r>
+      <w:proofErr w:type="gramStart"/>
+      <w:r>
+        <w:rPr>
+          <w:rFonts w:ascii="Times New Roman" w:hAnsi="Times New Roman" w:cs="Times New Roman"/>
+        </w:rPr>
+        <w:t>log</w:t>
+      </w:r>
+      <w:proofErr w:type="gramEnd"/>
+      <w:r>
+        <w:rPr>
+          <w:rFonts w:ascii="Times New Roman" w:hAnsi="Times New Roman" w:cs="Times New Roman"/>
+        </w:rPr>
+        <w:t>-normal, and log-logistic distributions.</w:t>
+      </w:r>
+    </w:p>
+    <w:p>
+      <w:pPr>
+        <w:jc w:val="both"/>
+        <w:rPr>
+          <w:rFonts w:ascii="Times New Roman" w:hAnsi="Times New Roman" w:cs="Times New Roman"/>
+        </w:rPr>
+      </w:pPr>
+      <w:r>
+        <w:rPr>
+          <w:rFonts w:ascii="Times New Roman" w:hAnsi="Times New Roman" w:cs="Times New Roman"/>
+        </w:rPr>
+        <w:lastRenderedPageBreak/>
+        <w:t xml:space="preserve">Finally, model adequacy was required to be supported by satisfactory </w:t>
+      </w:r>
+      <w:r>
+        <w:rPr>
+          <w:rFonts w:ascii="Times New Roman" w:hAnsi="Times New Roman" w:cs="Times New Roman"/>
+          <w:b/>
+          <w:bCs/>
+        </w:rPr>
+        <w:t>MCMC diagnostics</w:t>
+      </w:r>
+      <w:r>
+        <w:rPr>
+          <w:rFonts w:ascii="Times New Roman" w:hAnsi="Times New Roman" w:cs="Times New Roman"/>
+        </w:rPr>
+        <w:t xml:space="preserve">. For each model, the maximum potential scale-reduction statistic </w:t>
+      </w:r>
+      <m:oMath>
+        <m:acc>
+          <m:accPr>
+            <m:ctrlPr>
+              <w:rPr>
+                <w:rFonts w:ascii="Cambria Math" w:hAnsi="Cambria Math" w:cs="Times New Roman"/>
+                <w:i/>
+              </w:rPr>
+            </m:ctrlPr>
+          </m:accPr>
+          <m:e>
+            <m:r>
+              <w:rPr>
+                <w:rFonts w:ascii="Cambria Math" w:hAnsi="Cambria Math" w:cs="Times New Roman"/>
+              </w:rPr>
+              <m:t>R</m:t>
+            </m:r>
+          </m:e>
+        </m:acc>
+      </m:oMath>
+      <w:r>
+        <w:rPr>
+          <w:rFonts w:ascii="Times New Roman" w:hAnsi="Times New Roman" w:cs="Times New Roman"/>
+        </w:rPr>
+        <w:t xml:space="preserve"> </w:t>
+      </w:r>
+      <w:r>
+        <w:rPr>
+          <w:rFonts w:ascii="Times New Roman" w:hAnsi="Times New Roman" w:cs="Times New Roman"/>
+        </w:rPr>
+        <w:t xml:space="preserve">effective sample sizes, number of divergent transitions, and maximum tree-depth warnings were examined. Values of </w:t>
+      </w:r>
+      <m:oMath>
+        <m:acc>
+          <m:accPr>
+            <m:ctrlPr>
+              <w:rPr>
+                <w:rFonts w:ascii="Cambria Math" w:hAnsi="Cambria Math" w:cs="Times New Roman"/>
+                <w:i/>
+              </w:rPr>
+            </m:ctrlPr>
+          </m:accPr>
+          <m:e>
+            <m:r>
+              <w:rPr>
+                <w:rFonts w:ascii="Cambria Math" w:hAnsi="Cambria Math" w:cs="Times New Roman"/>
+              </w:rPr>
+              <m:t>R</m:t>
+            </m:r>
+          </m:e>
+        </m:acc>
+      </m:oMath>
+      <w:r>
+        <w:rPr>
+          <w:rFonts w:ascii="Times New Roman" w:hAnsi="Times New Roman" w:cs="Times New Roman"/>
+        </w:rPr>
+        <w:t xml:space="preserve"> close to 1, sufficiently large effective sample sizes, and the absence of divergent transitions were considered evidence of satisfactory posterior sampling.</w:t>
+      </w:r>
+    </w:p>
+    <w:p>
+      <w:pPr>
+        <w:jc w:val="both"/>
+        <w:rPr>
+          <w:rFonts w:ascii="Times New Roman" w:hAnsi="Times New Roman" w:cs="Times New Roman"/>
+        </w:rPr>
+      </w:pPr>
+      <w:r>
+        <w:rPr>
+          <w:rFonts w:ascii="Times New Roman" w:hAnsi="Times New Roman" w:cs="Times New Roman"/>
+        </w:rPr>
+        <w:t>Accordingly, the model-comparison procedure followed this hierarchy:</w:t>
+      </w:r>
+    </w:p>
+    <w:p>
+      <w:pPr>
+        <w:jc w:val="both"/>
+        <w:rPr>
+          <w:rFonts w:ascii="Times New Roman" w:hAnsi="Times New Roman" w:cs="Times New Roman"/>
+        </w:rPr>
+      </w:pPr>
+      <w:r>
+        <w:rPr>
+          <w:rFonts w:ascii="Times New Roman" w:hAnsi="Times New Roman" w:cs="Times New Roman"/>
+        </w:rPr>
+        <w:t xml:space="preserve">Primary: </w:t>
+      </w:r>
+      <m:oMath>
+        <m:r>
+          <w:rPr>
+            <w:rFonts w:ascii="Cambria Math" w:hAnsi="Cambria Math" w:cs="Times New Roman"/>
+          </w:rPr>
+          <m:t>ELP</m:t>
+        </m:r>
+        <m:sSub>
+          <m:sSubPr>
+            <m:ctrlPr>
+              <w:rPr>
+                <w:rFonts w:ascii="Cambria Math" w:hAnsi="Cambria Math" w:cs="Times New Roman"/>
+              </w:rPr>
+            </m:ctrlPr>
+          </m:sSubPr>
+          <m:e>
+            <m:r>
+              <w:rPr>
+                <w:rFonts w:ascii="Cambria Math" w:hAnsi="Cambria Math" w:cs="Times New Roman"/>
+              </w:rPr>
+              <m:t>D</m:t>
+            </m:r>
+          </m:e>
+          <m:sub>
+            <m:r>
+              <w:rPr>
+                <w:rFonts w:ascii="Cambria Math" w:hAnsi="Cambria Math" w:cs="Times New Roman"/>
+              </w:rPr>
+              <m:t>LOO</m:t>
+            </m:r>
+          </m:sub>
+        </m:sSub>
+      </m:oMath>
+    </w:p>
+    <w:p>
+      <w:pPr>
+        <w:jc w:val="both"/>
+        <w:rPr>
+          <w:rFonts w:ascii="Times New Roman" w:hAnsi="Times New Roman" w:cs="Times New Roman"/>
+        </w:rPr>
+      </w:pPr>
+      <w:r>
+        <w:rPr>
+          <w:rFonts w:ascii="Times New Roman" w:hAnsi="Times New Roman" w:cs="Times New Roman"/>
+        </w:rPr>
+        <w:t>Supporting: Brier Scores and IBS</w:t>
+      </w:r>
+    </w:p>
+    <w:p>
+      <w:pPr>
+        <w:jc w:val="both"/>
+        <w:rPr>
+          <w:rFonts w:ascii="Times New Roman" w:hAnsi="Times New Roman" w:cs="Times New Roman"/>
+        </w:rPr>
+      </w:pPr>
+      <w:r>
+        <w:rPr>
+          <w:rFonts w:ascii="Times New Roman" w:hAnsi="Times New Roman" w:cs="Times New Roman"/>
+        </w:rPr>
+        <w:t>Diagnostics: Pareto-</w:t>
+      </w:r>
+      <m:oMath>
+        <m:r>
+          <w:rPr>
+            <w:rFonts w:ascii="Cambria Math" w:hAnsi="Cambria Math" w:cs="Times New Roman"/>
+          </w:rPr>
+          <m:t>k</m:t>
+        </m:r>
+      </m:oMath>
+      <w:r>
+        <w:rPr>
+          <w:rFonts w:ascii="Times New Roman" w:hAnsi="Times New Roman" w:cs="Times New Roman"/>
+        </w:rPr>
+        <w:t xml:space="preserve"> and MCMC convergence</w:t>
+      </w:r>
+    </w:p>
+    <w:p>
+      <w:pPr>
+        <w:jc w:val="both"/>
+        <w:rPr>
+          <w:rFonts w:ascii="Times New Roman" w:hAnsi="Times New Roman" w:cs="Times New Roman"/>
+        </w:rPr>
+      </w:pPr>
+      <w:r>
+        <w:rPr>
+          <w:rFonts w:ascii="Times New Roman" w:hAnsi="Times New Roman" w:cs="Times New Roman"/>
+        </w:rPr>
+        <w:t>Sensitivity: posterior-predictive and standardized survival curves</w:t>
+      </w:r>
+    </w:p>
+    <w:p>
+      <w:pPr>
+        <w:jc w:val="both"/>
+        <w:rPr>
+          <w:rFonts w:ascii="Times New Roman" w:hAnsi="Times New Roman" w:cs="Times New Roman"/>
+        </w:rPr>
+      </w:pPr>
+      <w:r>
+        <w:rPr>
+          <w:rFonts w:ascii="Times New Roman" w:hAnsi="Times New Roman" w:cs="Times New Roman"/>
+        </w:rPr>
+        <w:t>The standardized survival curves for stage, age, and tumor grade were not used directly as the primary model-selection criterion. Instead, they were compared across distributions to determine whether the substantive conclusions were robust to the assumed survival distribution. For stage-specific curves, predictions were standardized over the observed age, sex, and grade distribution; for age-specific curves, over stage, sex, and grade; and for grade-specific curves, over stage, age, and sex.</w:t>
+      </w:r>
+    </w:p>
+    <w:p>
+      <w:pPr>
+        <w:jc w:val="both"/>
+        <w:rPr>
+          <w:rFonts w:ascii="Times New Roman" w:hAnsi="Times New Roman" w:cs="Times New Roman"/>
+          <w:b/>
+          <w:bCs/>
+        </w:rPr>
+      </w:pPr>
+      <w:r>
+        <w:rPr>
+          <w:rFonts w:ascii="Times New Roman" w:hAnsi="Times New Roman" w:cs="Times New Roman"/>
+          <w:b/>
+          <w:bCs/>
+        </w:rPr>
+        <w:t xml:space="preserve">**Please record </w:t>
+      </w:r>
+      <m:oMath>
+        <m:sSub>
+          <m:sSubPr>
+            <m:ctrlPr>
+              <w:rPr>
+                <w:rFonts w:ascii="Cambria Math" w:hAnsi="Cambria Math" w:cs="Times New Roman"/>
+                <w:b/>
+                <w:bCs/>
+                <w:i/>
+              </w:rPr>
+            </m:ctrlPr>
+          </m:sSubPr>
+          <m:e>
+            <m:r>
+              <m:rPr>
+                <m:sty m:val="bi"/>
+              </m:rPr>
+              <w:rPr>
+                <w:rFonts w:ascii="Cambria Math" w:hAnsi="Cambria Math" w:cs="Times New Roman"/>
+              </w:rPr>
+              <m:t>elpd</m:t>
+            </m:r>
+          </m:e>
+          <m:sub>
+            <m:sSub>
+              <m:sSubPr>
+                <m:ctrlPr>
+                  <w:rPr>
+                    <w:rFonts w:ascii="Cambria Math" w:hAnsi="Cambria Math" w:cs="Times New Roman"/>
+                    <w:b/>
+                    <w:bCs/>
+                    <w:i/>
+                  </w:rPr>
+                </m:ctrlPr>
+              </m:sSubPr>
+              <m:e>
+                <m:r>
+                  <m:rPr>
+                    <m:sty m:val="bi"/>
+                  </m:rPr>
+                  <w:rPr>
+                    <w:rFonts w:ascii="Cambria Math" w:hAnsi="Cambria Math" w:cs="Times New Roman"/>
+                  </w:rPr>
+                  <m:t>LOO</m:t>
+                </m:r>
+              </m:e>
+              <m:sub>
+                <m:r>
+                  <m:rPr>
+                    <m:sty m:val="bi"/>
+                  </m:rPr>
+                  <w:rPr>
+                    <w:rFonts w:ascii="Cambria Math" w:hAnsi="Cambria Math" w:cs="Times New Roman"/>
+                  </w:rPr>
+                  <m:t>i</m:t>
+                </m:r>
+              </m:sub>
+            </m:sSub>
+          </m:sub>
+        </m:sSub>
+      </m:oMath>
+      <w:r>
+        <w:rPr>
+          <w:rFonts w:ascii="Times New Roman" w:hAnsi="Times New Roman" w:cs="Times New Roman"/>
+          <w:b/>
+          <w:bCs/>
+        </w:rPr>
+        <w:t xml:space="preserve"> for the 521 patients in the .</w:t>
+      </w:r>
+      <w:proofErr w:type="spellStart"/>
+      <w:r>
+        <w:rPr>
+          <w:rFonts w:ascii="Times New Roman" w:hAnsi="Times New Roman" w:cs="Times New Roman"/>
+          <w:b/>
+          <w:bCs/>
+        </w:rPr>
+        <w:t>rds</w:t>
+      </w:r>
+      <w:proofErr w:type="spellEnd"/>
+      <w:r>
+        <w:rPr>
+          <w:rFonts w:ascii="Times New Roman" w:hAnsi="Times New Roman" w:cs="Times New Roman"/>
+          <w:b/>
+          <w:bCs/>
+        </w:rPr>
+        <w:t xml:space="preserve"> file as it will be required for </w:t>
+      </w:r>
+      <m:oMath>
+        <m:r>
+          <m:rPr>
+            <m:sty m:val="bi"/>
+          </m:rPr>
+          <w:rPr>
+            <w:rFonts w:ascii="Cambria Math" w:hAnsi="Cambria Math" w:cs="Times New Roman"/>
+          </w:rPr>
+          <m:t>SE(∆ELPD)</m:t>
+        </m:r>
+      </m:oMath>
     </w:p>
     <w:sectPr>
       <w:pgSz w:w="12240" w:h="15840"/>

</xml_diff>